<commit_message>
solo rut y nombre
</commit_message>
<xml_diff>
--- a/Carta Tratamiento dental Reconocer2.docx
+++ b/Carta Tratamiento dental Reconocer2.docx
@@ -1,6 +1,6 @@
 
 <file path=word/document.xml><?xml version="1.0" encoding="utf-8"?>
-<w:document xmlns:wpc="http://schemas.microsoft.com/office/word/2010/wordprocessingCanvas" xmlns:cx="http://schemas.microsoft.com/office/drawing/2014/chartex" xmlns:mc="http://schemas.openxmlformats.org/markup-compatibility/2006" xmlns:o="urn:schemas-microsoft-com:office:office" xmlns:r="http://schemas.openxmlformats.org/officeDocument/2006/relationships" xmlns:m="http://schemas.openxmlformats.org/officeDocument/2006/math" xmlns:v="urn:schemas-microsoft-com:vml" xmlns:wp14="http://schemas.microsoft.com/office/word/2010/wordprocessingDrawing" xmlns:wp="http://schemas.openxmlformats.org/drawingml/2006/wordprocessingDrawing" xmlns:w10="urn:schemas-microsoft-com:office:word" xmlns:w="http://schemas.openxmlformats.org/wordprocessingml/2006/main" xmlns:w14="http://schemas.microsoft.com/office/word/2010/wordml" xmlns:w15="http://schemas.microsoft.com/office/word/2012/wordml" xmlns:w16se="http://schemas.microsoft.com/office/word/2015/wordml/symex" xmlns:wpg="http://schemas.microsoft.com/office/word/2010/wordprocessingGroup" xmlns:wpi="http://schemas.microsoft.com/office/word/2010/wordprocessingInk" xmlns:wne="http://schemas.microsoft.com/office/word/2006/wordml" xmlns:wps="http://schemas.microsoft.com/office/word/2010/wordprocessingShape" mc:Ignorable="w14 w15 w16se wp14">
+<w:document xmlns:wpc="http://schemas.microsoft.com/office/word/2010/wordprocessingCanvas" xmlns:cx="http://schemas.microsoft.com/office/drawing/2014/chartex" xmlns:cx1="http://schemas.microsoft.com/office/drawing/2015/9/8/chartex" xmlns:cx2="http://schemas.microsoft.com/office/drawing/2015/10/21/chartex" xmlns:cx3="http://schemas.microsoft.com/office/drawing/2016/5/9/chartex" xmlns:cx4="http://schemas.microsoft.com/office/drawing/2016/5/10/chartex" xmlns:cx5="http://schemas.microsoft.com/office/drawing/2016/5/11/chartex" xmlns:cx6="http://schemas.microsoft.com/office/drawing/2016/5/12/chartex" xmlns:cx7="http://schemas.microsoft.com/office/drawing/2016/5/13/chartex" xmlns:cx8="http://schemas.microsoft.com/office/drawing/2016/5/14/chartex" xmlns:mc="http://schemas.openxmlformats.org/markup-compatibility/2006" xmlns:aink="http://schemas.microsoft.com/office/drawing/2016/ink" xmlns:am3d="http://schemas.microsoft.com/office/drawing/2017/model3d" xmlns:o="urn:schemas-microsoft-com:office:office" xmlns:oel="http://schemas.microsoft.com/office/2019/extlst" xmlns:r="http://schemas.openxmlformats.org/officeDocument/2006/relationships" xmlns:m="http://schemas.openxmlformats.org/officeDocument/2006/math" xmlns:v="urn:schemas-microsoft-com:vml" xmlns:wp14="http://schemas.microsoft.com/office/word/2010/wordprocessingDrawing" xmlns:wp="http://schemas.openxmlformats.org/drawingml/2006/wordprocessingDrawing" xmlns:w10="urn:schemas-microsoft-com:office:word" xmlns:w="http://schemas.openxmlformats.org/wordprocessingml/2006/main" xmlns:w14="http://schemas.microsoft.com/office/word/2010/wordml" xmlns:w15="http://schemas.microsoft.com/office/word/2012/wordml" xmlns:w16cex="http://schemas.microsoft.com/office/word/2018/wordml/cex" xmlns:w16cid="http://schemas.microsoft.com/office/word/2016/wordml/cid" xmlns:w16="http://schemas.microsoft.com/office/word/2018/wordml" xmlns:w16du="http://schemas.microsoft.com/office/word/2023/wordml/word16du" xmlns:w16sdtdh="http://schemas.microsoft.com/office/word/2020/wordml/sdtdatahash" xmlns:w16sdtfl="http://schemas.microsoft.com/office/word/2024/wordml/sdtformatlock" xmlns:w16se="http://schemas.microsoft.com/office/word/2015/wordml/symex" xmlns:wpg="http://schemas.microsoft.com/office/word/2010/wordprocessingGroup" xmlns:wpi="http://schemas.microsoft.com/office/word/2010/wordprocessingInk" xmlns:wne="http://schemas.microsoft.com/office/word/2006/wordml" xmlns:wps="http://schemas.microsoft.com/office/word/2010/wordprocessingShape" mc:Ignorable="w14 w15 w16se w16cid w16 w16cex w16sdtdh w16sdtfl w16du wp14">
   <w:body>
     <w:p>
       <w:pPr>
@@ -776,7 +776,7 @@
                 <w:rFonts w:ascii="Calibri" w:eastAsia="Calibri" w:hAnsi="Calibri" w:cs="Calibri"/>
                 <w:color w:val="000000"/>
               </w:rPr>
-              <w:t>15</w:t>
+              <w:t>25</w:t>
             </w:r>
             <w:r>
               <w:rPr>
@@ -1661,14 +1661,12 @@
                 <w:rFonts w:ascii="Calibri" w:eastAsia="Calibri" w:hAnsi="Calibri" w:cs="Calibri"/>
               </w:rPr>
             </w:pPr>
-            <w:proofErr w:type="spellStart"/>
             <w:r>
               <w:rPr>
                 <w:rFonts w:ascii="Calibri" w:eastAsia="Calibri" w:hAnsi="Calibri" w:cs="Calibri"/>
               </w:rPr>
               <w:t>NombreTemplate</w:t>
             </w:r>
-            <w:proofErr w:type="spellEnd"/>
           </w:p>
         </w:tc>
         <w:tc>
@@ -1723,14 +1721,12 @@
                 <w:rFonts w:ascii="Calibri" w:eastAsia="Calibri" w:hAnsi="Calibri" w:cs="Calibri"/>
               </w:rPr>
             </w:pPr>
-            <w:proofErr w:type="spellStart"/>
             <w:r>
               <w:rPr>
                 <w:rFonts w:ascii="Calibri" w:eastAsia="Calibri" w:hAnsi="Calibri" w:cs="Calibri"/>
               </w:rPr>
               <w:t>IdTemplate</w:t>
             </w:r>
-            <w:proofErr w:type="spellEnd"/>
           </w:p>
         </w:tc>
         <w:tc>
@@ -1810,14 +1806,12 @@
                 <w:rFonts w:ascii="Calibri" w:eastAsia="Calibri" w:hAnsi="Calibri" w:cs="Calibri"/>
               </w:rPr>
             </w:pPr>
-            <w:proofErr w:type="spellStart"/>
             <w:r>
               <w:rPr>
                 <w:rFonts w:ascii="Calibri" w:eastAsia="Calibri" w:hAnsi="Calibri" w:cs="Calibri"/>
               </w:rPr>
               <w:t>RutTemplate</w:t>
             </w:r>
-            <w:proofErr w:type="spellEnd"/>
           </w:p>
         </w:tc>
         <w:tc>
@@ -1923,13 +1917,6 @@
                 <w:color w:val="000000"/>
               </w:rPr>
             </w:pPr>
-            <w:r>
-              <w:rPr>
-                <w:rFonts w:ascii="Calibri" w:eastAsia="Calibri" w:hAnsi="Calibri" w:cs="Calibri"/>
-                <w:color w:val="000000"/>
-              </w:rPr>
-              <w:t>EDAD</w:t>
-            </w:r>
           </w:p>
         </w:tc>
         <w:tc>
@@ -1943,147 +1930,6 @@
                 <w:rFonts w:ascii="Calibri" w:eastAsia="Calibri" w:hAnsi="Calibri" w:cs="Calibri"/>
               </w:rPr>
             </w:pPr>
-            <w:proofErr w:type="spellStart"/>
-            <w:r>
-              <w:rPr>
-                <w:rFonts w:ascii="Calibri" w:eastAsia="Calibri" w:hAnsi="Calibri" w:cs="Calibri"/>
-              </w:rPr>
-              <w:t>EdadTemplate</w:t>
-            </w:r>
-            <w:proofErr w:type="spellEnd"/>
-          </w:p>
-        </w:tc>
-        <w:tc>
-          <w:tcPr>
-            <w:tcW w:w="96" w:type="dxa"/>
-          </w:tcPr>
-          <w:p>
-            <w:pPr>
-              <w:pBdr>
-                <w:top w:val="nil"/>
-                <w:left w:val="nil"/>
-                <w:bottom w:val="nil"/>
-                <w:right w:val="nil"/>
-                <w:between w:val="nil"/>
-              </w:pBdr>
-              <w:rPr>
-                <w:rFonts w:ascii="Calibri" w:eastAsia="Calibri" w:hAnsi="Calibri" w:cs="Calibri"/>
-                <w:color w:val="000000"/>
-              </w:rPr>
-            </w:pPr>
-          </w:p>
-        </w:tc>
-        <w:tc>
-          <w:tcPr>
-            <w:tcW w:w="433" w:type="dxa"/>
-          </w:tcPr>
-          <w:p>
-            <w:pPr>
-              <w:rPr>
-                <w:rFonts w:ascii="Calibri" w:eastAsia="Calibri" w:hAnsi="Calibri" w:cs="Calibri"/>
-                <w:color w:val="000000"/>
-              </w:rPr>
-            </w:pPr>
-          </w:p>
-        </w:tc>
-        <w:tc>
-          <w:tcPr>
-            <w:tcW w:w="1891" w:type="dxa"/>
-            <w:gridSpan w:val="5"/>
-          </w:tcPr>
-          <w:p>
-            <w:pPr>
-              <w:rPr>
-                <w:rFonts w:ascii="Calibri" w:eastAsia="Calibri" w:hAnsi="Calibri" w:cs="Calibri"/>
-              </w:rPr>
-            </w:pPr>
-          </w:p>
-        </w:tc>
-        <w:tc>
-          <w:tcPr>
-            <w:tcW w:w="119" w:type="dxa"/>
-          </w:tcPr>
-          <w:p>
-            <w:pPr>
-              <w:pBdr>
-                <w:top w:val="nil"/>
-                <w:left w:val="nil"/>
-                <w:bottom w:val="nil"/>
-                <w:right w:val="nil"/>
-                <w:between w:val="nil"/>
-              </w:pBdr>
-              <w:rPr>
-                <w:rFonts w:ascii="Calibri" w:eastAsia="Calibri" w:hAnsi="Calibri" w:cs="Calibri"/>
-                <w:color w:val="000000"/>
-              </w:rPr>
-            </w:pPr>
-          </w:p>
-        </w:tc>
-        <w:tc>
-          <w:tcPr>
-            <w:tcW w:w="115" w:type="dxa"/>
-          </w:tcPr>
-          <w:p>
-            <w:pPr>
-              <w:pBdr>
-                <w:top w:val="nil"/>
-                <w:left w:val="nil"/>
-                <w:bottom w:val="nil"/>
-                <w:right w:val="nil"/>
-                <w:between w:val="nil"/>
-              </w:pBdr>
-              <w:rPr>
-                <w:rFonts w:ascii="Calibri" w:eastAsia="Calibri" w:hAnsi="Calibri" w:cs="Calibri"/>
-                <w:color w:val="000000"/>
-              </w:rPr>
-            </w:pPr>
-          </w:p>
-        </w:tc>
-      </w:tr>
-      <w:tr>
-        <w:trPr>
-          <w:trHeight w:val="283"/>
-        </w:trPr>
-        <w:tc>
-          <w:tcPr>
-            <w:tcW w:w="1174" w:type="dxa"/>
-            <w:gridSpan w:val="3"/>
-          </w:tcPr>
-          <w:p>
-            <w:pPr>
-              <w:rPr>
-                <w:rFonts w:ascii="Calibri" w:eastAsia="Calibri" w:hAnsi="Calibri" w:cs="Calibri"/>
-                <w:color w:val="000000"/>
-              </w:rPr>
-            </w:pPr>
-            <w:r>
-              <w:rPr>
-                <w:rFonts w:ascii="Calibri" w:eastAsia="Calibri" w:hAnsi="Calibri" w:cs="Calibri"/>
-                <w:color w:val="000000"/>
-              </w:rPr>
-              <w:t>F. NAC.</w:t>
-            </w:r>
-          </w:p>
-        </w:tc>
-        <w:tc>
-          <w:tcPr>
-            <w:tcW w:w="6371" w:type="dxa"/>
-            <w:gridSpan w:val="11"/>
-          </w:tcPr>
-          <w:p>
-            <w:pPr>
-              <w:rPr>
-                <w:rFonts w:ascii="Calibri" w:eastAsia="Calibri" w:hAnsi="Calibri" w:cs="Calibri"/>
-              </w:rPr>
-            </w:pPr>
-            <w:proofErr w:type="spellStart"/>
-            <w:r>
-              <w:rPr>
-                <w:rFonts w:ascii="Calibri" w:eastAsia="Calibri" w:hAnsi="Calibri" w:cs="Calibri"/>
-              </w:rPr>
-              <w:t>FechaDeNacimientoTemplate</w:t>
-            </w:r>
-            <w:proofErr w:type="spellEnd"/>
           </w:p>
         </w:tc>
         <w:tc>
@@ -2722,17 +2568,13 @@
                     </w:rPr>
                     <w:t xml:space="preserve">a un costo de </w:t>
                   </w:r>
-                  <w:proofErr w:type="spellStart"/>
                   <w:r>
                     <w:rPr>
                       <w:rFonts w:ascii="Calibri" w:eastAsia="Calibri" w:hAnsi="Calibri" w:cs="Calibri"/>
                       <w:color w:val="000000"/>
                     </w:rPr>
-                    <w:t>PrecioTemplate</w:t>
+                    <w:t>$9.990</w:t>
                   </w:r>
-                  <w:bookmarkStart w:id="0" w:name="_GoBack"/>
-                  <w:bookmarkEnd w:id="0"/>
-                  <w:proofErr w:type="spellEnd"/>
                 </w:p>
                 <w:p>
                   <w:pPr>
@@ -3919,7 +3761,7 @@
 </file>
 
 <file path=word/endnotes.xml><?xml version="1.0" encoding="utf-8"?>
-<w:endnotes xmlns:wpc="http://schemas.microsoft.com/office/word/2010/wordprocessingCanvas" xmlns:cx="http://schemas.microsoft.com/office/drawing/2014/chartex" xmlns:mc="http://schemas.openxmlformats.org/markup-compatibility/2006" xmlns:o="urn:schemas-microsoft-com:office:office" xmlns:r="http://schemas.openxmlformats.org/officeDocument/2006/relationships" xmlns:m="http://schemas.openxmlformats.org/officeDocument/2006/math" xmlns:v="urn:schemas-microsoft-com:vml" xmlns:wp14="http://schemas.microsoft.com/office/word/2010/wordprocessingDrawing" xmlns:wp="http://schemas.openxmlformats.org/drawingml/2006/wordprocessingDrawing" xmlns:w10="urn:schemas-microsoft-com:office:word" xmlns:w="http://schemas.openxmlformats.org/wordprocessingml/2006/main" xmlns:w14="http://schemas.microsoft.com/office/word/2010/wordml" xmlns:w15="http://schemas.microsoft.com/office/word/2012/wordml" xmlns:w16se="http://schemas.microsoft.com/office/word/2015/wordml/symex" xmlns:wpg="http://schemas.microsoft.com/office/word/2010/wordprocessingGroup" xmlns:wpi="http://schemas.microsoft.com/office/word/2010/wordprocessingInk" xmlns:wne="http://schemas.microsoft.com/office/word/2006/wordml" xmlns:wps="http://schemas.microsoft.com/office/word/2010/wordprocessingShape" mc:Ignorable="w14 w15 w16se wp14">
+<w:endnotes xmlns:wpc="http://schemas.microsoft.com/office/word/2010/wordprocessingCanvas" xmlns:cx="http://schemas.microsoft.com/office/drawing/2014/chartex" xmlns:cx1="http://schemas.microsoft.com/office/drawing/2015/9/8/chartex" xmlns:cx2="http://schemas.microsoft.com/office/drawing/2015/10/21/chartex" xmlns:cx3="http://schemas.microsoft.com/office/drawing/2016/5/9/chartex" xmlns:cx4="http://schemas.microsoft.com/office/drawing/2016/5/10/chartex" xmlns:cx5="http://schemas.microsoft.com/office/drawing/2016/5/11/chartex" xmlns:cx6="http://schemas.microsoft.com/office/drawing/2016/5/12/chartex" xmlns:cx7="http://schemas.microsoft.com/office/drawing/2016/5/13/chartex" xmlns:cx8="http://schemas.microsoft.com/office/drawing/2016/5/14/chartex" xmlns:mc="http://schemas.openxmlformats.org/markup-compatibility/2006" xmlns:aink="http://schemas.microsoft.com/office/drawing/2016/ink" xmlns:am3d="http://schemas.microsoft.com/office/drawing/2017/model3d" xmlns:o="urn:schemas-microsoft-com:office:office" xmlns:oel="http://schemas.microsoft.com/office/2019/extlst" xmlns:r="http://schemas.openxmlformats.org/officeDocument/2006/relationships" xmlns:m="http://schemas.openxmlformats.org/officeDocument/2006/math" xmlns:v="urn:schemas-microsoft-com:vml" xmlns:wp14="http://schemas.microsoft.com/office/word/2010/wordprocessingDrawing" xmlns:wp="http://schemas.openxmlformats.org/drawingml/2006/wordprocessingDrawing" xmlns:w10="urn:schemas-microsoft-com:office:word" xmlns:w="http://schemas.openxmlformats.org/wordprocessingml/2006/main" xmlns:w14="http://schemas.microsoft.com/office/word/2010/wordml" xmlns:w15="http://schemas.microsoft.com/office/word/2012/wordml" xmlns:w16cex="http://schemas.microsoft.com/office/word/2018/wordml/cex" xmlns:w16cid="http://schemas.microsoft.com/office/word/2016/wordml/cid" xmlns:w16="http://schemas.microsoft.com/office/word/2018/wordml" xmlns:w16du="http://schemas.microsoft.com/office/word/2023/wordml/word16du" xmlns:w16sdtdh="http://schemas.microsoft.com/office/word/2020/wordml/sdtdatahash" xmlns:w16sdtfl="http://schemas.microsoft.com/office/word/2024/wordml/sdtformatlock" xmlns:w16se="http://schemas.microsoft.com/office/word/2015/wordml/symex" xmlns:wpg="http://schemas.microsoft.com/office/word/2010/wordprocessingGroup" xmlns:wpi="http://schemas.microsoft.com/office/word/2010/wordprocessingInk" xmlns:wne="http://schemas.microsoft.com/office/word/2006/wordml" xmlns:wps="http://schemas.microsoft.com/office/word/2010/wordprocessingShape" mc:Ignorable="w14 w15 w16se w16cid w16 w16cex w16sdtdh w16sdtfl w16du wp14">
   <w:endnote w:type="separator" w:id="-1">
     <w:p>
       <w:r>
@@ -3938,7 +3780,7 @@
 </file>
 
 <file path=word/footer1.xml><?xml version="1.0" encoding="utf-8"?>
-<w:ftr xmlns:wpc="http://schemas.microsoft.com/office/word/2010/wordprocessingCanvas" xmlns:cx="http://schemas.microsoft.com/office/drawing/2014/chartex" xmlns:mc="http://schemas.openxmlformats.org/markup-compatibility/2006" xmlns:o="urn:schemas-microsoft-com:office:office" xmlns:r="http://schemas.openxmlformats.org/officeDocument/2006/relationships" xmlns:m="http://schemas.openxmlformats.org/officeDocument/2006/math" xmlns:v="urn:schemas-microsoft-com:vml" xmlns:wp14="http://schemas.microsoft.com/office/word/2010/wordprocessingDrawing" xmlns:wp="http://schemas.openxmlformats.org/drawingml/2006/wordprocessingDrawing" xmlns:w10="urn:schemas-microsoft-com:office:word" xmlns:w="http://schemas.openxmlformats.org/wordprocessingml/2006/main" xmlns:w14="http://schemas.microsoft.com/office/word/2010/wordml" xmlns:w15="http://schemas.microsoft.com/office/word/2012/wordml" xmlns:w16se="http://schemas.microsoft.com/office/word/2015/wordml/symex" xmlns:wpg="http://schemas.microsoft.com/office/word/2010/wordprocessingGroup" xmlns:wpi="http://schemas.microsoft.com/office/word/2010/wordprocessingInk" xmlns:wne="http://schemas.microsoft.com/office/word/2006/wordml" xmlns:wps="http://schemas.microsoft.com/office/word/2010/wordprocessingShape" mc:Ignorable="w14 w15 w16se wp14">
+<w:ftr xmlns:wpc="http://schemas.microsoft.com/office/word/2010/wordprocessingCanvas" xmlns:cx="http://schemas.microsoft.com/office/drawing/2014/chartex" xmlns:cx1="http://schemas.microsoft.com/office/drawing/2015/9/8/chartex" xmlns:cx2="http://schemas.microsoft.com/office/drawing/2015/10/21/chartex" xmlns:cx3="http://schemas.microsoft.com/office/drawing/2016/5/9/chartex" xmlns:cx4="http://schemas.microsoft.com/office/drawing/2016/5/10/chartex" xmlns:cx5="http://schemas.microsoft.com/office/drawing/2016/5/11/chartex" xmlns:cx6="http://schemas.microsoft.com/office/drawing/2016/5/12/chartex" xmlns:cx7="http://schemas.microsoft.com/office/drawing/2016/5/13/chartex" xmlns:cx8="http://schemas.microsoft.com/office/drawing/2016/5/14/chartex" xmlns:mc="http://schemas.openxmlformats.org/markup-compatibility/2006" xmlns:aink="http://schemas.microsoft.com/office/drawing/2016/ink" xmlns:am3d="http://schemas.microsoft.com/office/drawing/2017/model3d" xmlns:o="urn:schemas-microsoft-com:office:office" xmlns:oel="http://schemas.microsoft.com/office/2019/extlst" xmlns:r="http://schemas.openxmlformats.org/officeDocument/2006/relationships" xmlns:m="http://schemas.openxmlformats.org/officeDocument/2006/math" xmlns:v="urn:schemas-microsoft-com:vml" xmlns:wp14="http://schemas.microsoft.com/office/word/2010/wordprocessingDrawing" xmlns:wp="http://schemas.openxmlformats.org/drawingml/2006/wordprocessingDrawing" xmlns:w10="urn:schemas-microsoft-com:office:word" xmlns:w="http://schemas.openxmlformats.org/wordprocessingml/2006/main" xmlns:w14="http://schemas.microsoft.com/office/word/2010/wordml" xmlns:w15="http://schemas.microsoft.com/office/word/2012/wordml" xmlns:w16cex="http://schemas.microsoft.com/office/word/2018/wordml/cex" xmlns:w16cid="http://schemas.microsoft.com/office/word/2016/wordml/cid" xmlns:w16="http://schemas.microsoft.com/office/word/2018/wordml" xmlns:w16du="http://schemas.microsoft.com/office/word/2023/wordml/word16du" xmlns:w16sdtdh="http://schemas.microsoft.com/office/word/2020/wordml/sdtdatahash" xmlns:w16sdtfl="http://schemas.microsoft.com/office/word/2024/wordml/sdtformatlock" xmlns:w16se="http://schemas.microsoft.com/office/word/2015/wordml/symex" xmlns:wpg="http://schemas.microsoft.com/office/word/2010/wordprocessingGroup" xmlns:wpi="http://schemas.microsoft.com/office/word/2010/wordprocessingInk" xmlns:wne="http://schemas.microsoft.com/office/word/2006/wordml" xmlns:wps="http://schemas.microsoft.com/office/word/2010/wordprocessingShape" mc:Ignorable="w14 w15 w16se w16cid w16 w16cex w16sdtdh w16sdtfl w16du wp14">
   <w:p>
     <w:pPr>
       <w:pBdr>
@@ -4072,7 +3914,7 @@
 </file>
 
 <file path=word/footnotes.xml><?xml version="1.0" encoding="utf-8"?>
-<w:footnotes xmlns:wpc="http://schemas.microsoft.com/office/word/2010/wordprocessingCanvas" xmlns:cx="http://schemas.microsoft.com/office/drawing/2014/chartex" xmlns:mc="http://schemas.openxmlformats.org/markup-compatibility/2006" xmlns:o="urn:schemas-microsoft-com:office:office" xmlns:r="http://schemas.openxmlformats.org/officeDocument/2006/relationships" xmlns:m="http://schemas.openxmlformats.org/officeDocument/2006/math" xmlns:v="urn:schemas-microsoft-com:vml" xmlns:wp14="http://schemas.microsoft.com/office/word/2010/wordprocessingDrawing" xmlns:wp="http://schemas.openxmlformats.org/drawingml/2006/wordprocessingDrawing" xmlns:w10="urn:schemas-microsoft-com:office:word" xmlns:w="http://schemas.openxmlformats.org/wordprocessingml/2006/main" xmlns:w14="http://schemas.microsoft.com/office/word/2010/wordml" xmlns:w15="http://schemas.microsoft.com/office/word/2012/wordml" xmlns:w16se="http://schemas.microsoft.com/office/word/2015/wordml/symex" xmlns:wpg="http://schemas.microsoft.com/office/word/2010/wordprocessingGroup" xmlns:wpi="http://schemas.microsoft.com/office/word/2010/wordprocessingInk" xmlns:wne="http://schemas.microsoft.com/office/word/2006/wordml" xmlns:wps="http://schemas.microsoft.com/office/word/2010/wordprocessingShape" mc:Ignorable="w14 w15 w16se wp14">
+<w:footnotes xmlns:wpc="http://schemas.microsoft.com/office/word/2010/wordprocessingCanvas" xmlns:cx="http://schemas.microsoft.com/office/drawing/2014/chartex" xmlns:cx1="http://schemas.microsoft.com/office/drawing/2015/9/8/chartex" xmlns:cx2="http://schemas.microsoft.com/office/drawing/2015/10/21/chartex" xmlns:cx3="http://schemas.microsoft.com/office/drawing/2016/5/9/chartex" xmlns:cx4="http://schemas.microsoft.com/office/drawing/2016/5/10/chartex" xmlns:cx5="http://schemas.microsoft.com/office/drawing/2016/5/11/chartex" xmlns:cx6="http://schemas.microsoft.com/office/drawing/2016/5/12/chartex" xmlns:cx7="http://schemas.microsoft.com/office/drawing/2016/5/13/chartex" xmlns:cx8="http://schemas.microsoft.com/office/drawing/2016/5/14/chartex" xmlns:mc="http://schemas.openxmlformats.org/markup-compatibility/2006" xmlns:aink="http://schemas.microsoft.com/office/drawing/2016/ink" xmlns:am3d="http://schemas.microsoft.com/office/drawing/2017/model3d" xmlns:o="urn:schemas-microsoft-com:office:office" xmlns:oel="http://schemas.microsoft.com/office/2019/extlst" xmlns:r="http://schemas.openxmlformats.org/officeDocument/2006/relationships" xmlns:m="http://schemas.openxmlformats.org/officeDocument/2006/math" xmlns:v="urn:schemas-microsoft-com:vml" xmlns:wp14="http://schemas.microsoft.com/office/word/2010/wordprocessingDrawing" xmlns:wp="http://schemas.openxmlformats.org/drawingml/2006/wordprocessingDrawing" xmlns:w10="urn:schemas-microsoft-com:office:word" xmlns:w="http://schemas.openxmlformats.org/wordprocessingml/2006/main" xmlns:w14="http://schemas.microsoft.com/office/word/2010/wordml" xmlns:w15="http://schemas.microsoft.com/office/word/2012/wordml" xmlns:w16cex="http://schemas.microsoft.com/office/word/2018/wordml/cex" xmlns:w16cid="http://schemas.microsoft.com/office/word/2016/wordml/cid" xmlns:w16="http://schemas.microsoft.com/office/word/2018/wordml" xmlns:w16du="http://schemas.microsoft.com/office/word/2023/wordml/word16du" xmlns:w16sdtdh="http://schemas.microsoft.com/office/word/2020/wordml/sdtdatahash" xmlns:w16sdtfl="http://schemas.microsoft.com/office/word/2024/wordml/sdtformatlock" xmlns:w16se="http://schemas.microsoft.com/office/word/2015/wordml/symex" xmlns:wpg="http://schemas.microsoft.com/office/word/2010/wordprocessingGroup" xmlns:wpi="http://schemas.microsoft.com/office/word/2010/wordprocessingInk" xmlns:wne="http://schemas.microsoft.com/office/word/2006/wordml" xmlns:wps="http://schemas.microsoft.com/office/word/2010/wordprocessingShape" mc:Ignorable="w14 w15 w16se w16cid w16 w16cex w16sdtdh w16sdtfl w16du wp14">
   <w:footnote w:type="separator" w:id="-1">
     <w:p>
       <w:r>
@@ -4091,7 +3933,7 @@
 </file>
 
 <file path=word/numbering.xml><?xml version="1.0" encoding="utf-8"?>
-<w:numbering xmlns:wpc="http://schemas.microsoft.com/office/word/2010/wordprocessingCanvas" xmlns:cx="http://schemas.microsoft.com/office/drawing/2014/chartex" xmlns:mc="http://schemas.openxmlformats.org/markup-compatibility/2006" xmlns:o="urn:schemas-microsoft-com:office:office" xmlns:r="http://schemas.openxmlformats.org/officeDocument/2006/relationships" xmlns:m="http://schemas.openxmlformats.org/officeDocument/2006/math" xmlns:v="urn:schemas-microsoft-com:vml" xmlns:wp14="http://schemas.microsoft.com/office/word/2010/wordprocessingDrawing" xmlns:wp="http://schemas.openxmlformats.org/drawingml/2006/wordprocessingDrawing" xmlns:w10="urn:schemas-microsoft-com:office:word" xmlns:w="http://schemas.openxmlformats.org/wordprocessingml/2006/main" xmlns:w14="http://schemas.microsoft.com/office/word/2010/wordml" xmlns:w15="http://schemas.microsoft.com/office/word/2012/wordml" xmlns:w16se="http://schemas.microsoft.com/office/word/2015/wordml/symex" xmlns:wpg="http://schemas.microsoft.com/office/word/2010/wordprocessingGroup" xmlns:wpi="http://schemas.microsoft.com/office/word/2010/wordprocessingInk" xmlns:wne="http://schemas.microsoft.com/office/word/2006/wordml" xmlns:wps="http://schemas.microsoft.com/office/word/2010/wordprocessingShape" mc:Ignorable="w14 w15 w16se wp14">
+<w:numbering xmlns:wpc="http://schemas.microsoft.com/office/word/2010/wordprocessingCanvas" xmlns:cx="http://schemas.microsoft.com/office/drawing/2014/chartex" xmlns:cx1="http://schemas.microsoft.com/office/drawing/2015/9/8/chartex" xmlns:cx2="http://schemas.microsoft.com/office/drawing/2015/10/21/chartex" xmlns:cx3="http://schemas.microsoft.com/office/drawing/2016/5/9/chartex" xmlns:cx4="http://schemas.microsoft.com/office/drawing/2016/5/10/chartex" xmlns:cx5="http://schemas.microsoft.com/office/drawing/2016/5/11/chartex" xmlns:cx6="http://schemas.microsoft.com/office/drawing/2016/5/12/chartex" xmlns:cx7="http://schemas.microsoft.com/office/drawing/2016/5/13/chartex" xmlns:cx8="http://schemas.microsoft.com/office/drawing/2016/5/14/chartex" xmlns:mc="http://schemas.openxmlformats.org/markup-compatibility/2006" xmlns:aink="http://schemas.microsoft.com/office/drawing/2016/ink" xmlns:am3d="http://schemas.microsoft.com/office/drawing/2017/model3d" xmlns:o="urn:schemas-microsoft-com:office:office" xmlns:oel="http://schemas.microsoft.com/office/2019/extlst" xmlns:r="http://schemas.openxmlformats.org/officeDocument/2006/relationships" xmlns:m="http://schemas.openxmlformats.org/officeDocument/2006/math" xmlns:v="urn:schemas-microsoft-com:vml" xmlns:wp14="http://schemas.microsoft.com/office/word/2010/wordprocessingDrawing" xmlns:wp="http://schemas.openxmlformats.org/drawingml/2006/wordprocessingDrawing" xmlns:w10="urn:schemas-microsoft-com:office:word" xmlns:w="http://schemas.openxmlformats.org/wordprocessingml/2006/main" xmlns:w14="http://schemas.microsoft.com/office/word/2010/wordml" xmlns:w15="http://schemas.microsoft.com/office/word/2012/wordml" xmlns:w16cex="http://schemas.microsoft.com/office/word/2018/wordml/cex" xmlns:w16cid="http://schemas.microsoft.com/office/word/2016/wordml/cid" xmlns:w16="http://schemas.microsoft.com/office/word/2018/wordml" xmlns:w16du="http://schemas.microsoft.com/office/word/2023/wordml/word16du" xmlns:w16sdtdh="http://schemas.microsoft.com/office/word/2020/wordml/sdtdatahash" xmlns:w16sdtfl="http://schemas.microsoft.com/office/word/2024/wordml/sdtformatlock" xmlns:w16se="http://schemas.microsoft.com/office/word/2015/wordml/symex" xmlns:wpg="http://schemas.microsoft.com/office/word/2010/wordprocessingGroup" xmlns:wpi="http://schemas.microsoft.com/office/word/2010/wordprocessingInk" xmlns:wne="http://schemas.microsoft.com/office/word/2006/wordml" xmlns:wps="http://schemas.microsoft.com/office/word/2010/wordprocessingShape" mc:Ignorable="w14 w15 w16se w16cid w16 w16cex w16sdtdh w16sdtfl w16du wp14">
   <w:abstractNum w:abstractNumId="0" w15:restartNumberingAfterBreak="0">
     <w:nsid w:val="3F421B2C"/>
     <w:multiLevelType w:val="multilevel"/>
@@ -4205,14 +4047,14 @@
       </w:rPr>
     </w:lvl>
   </w:abstractNum>
-  <w:num w:numId="1">
+  <w:num w:numId="1" w16cid:durableId="1441609868">
     <w:abstractNumId w:val="0"/>
   </w:num>
 </w:numbering>
 </file>
 
 <file path=word/styles.xml><?xml version="1.0" encoding="utf-8"?>
-<w:styles xmlns:mc="http://schemas.openxmlformats.org/markup-compatibility/2006" xmlns:r="http://schemas.openxmlformats.org/officeDocument/2006/relationships" xmlns:w="http://schemas.openxmlformats.org/wordprocessingml/2006/main" xmlns:w14="http://schemas.microsoft.com/office/word/2010/wordml" xmlns:w15="http://schemas.microsoft.com/office/word/2012/wordml" xmlns:w16se="http://schemas.microsoft.com/office/word/2015/wordml/symex" mc:Ignorable="w14 w15 w16se">
+<w:styles xmlns:mc="http://schemas.openxmlformats.org/markup-compatibility/2006" xmlns:r="http://schemas.openxmlformats.org/officeDocument/2006/relationships" xmlns:w="http://schemas.openxmlformats.org/wordprocessingml/2006/main" xmlns:w14="http://schemas.microsoft.com/office/word/2010/wordml" xmlns:w15="http://schemas.microsoft.com/office/word/2012/wordml" xmlns:w16cex="http://schemas.microsoft.com/office/word/2018/wordml/cex" xmlns:w16cid="http://schemas.microsoft.com/office/word/2016/wordml/cid" xmlns:w16="http://schemas.microsoft.com/office/word/2018/wordml" xmlns:w16du="http://schemas.microsoft.com/office/word/2023/wordml/word16du" xmlns:w16sdtdh="http://schemas.microsoft.com/office/word/2020/wordml/sdtdatahash" xmlns:w16sdtfl="http://schemas.microsoft.com/office/word/2024/wordml/sdtformatlock" xmlns:w16se="http://schemas.microsoft.com/office/word/2015/wordml/symex" mc:Ignorable="w14 w15 w16se w16cid w16 w16cex w16sdtdh w16sdtfl w16du">
   <w:docDefaults>
     <w:rPrDefault>
       <w:rPr>
@@ -4222,7 +4064,7 @@
     </w:rPrDefault>
     <w:pPrDefault/>
   </w:docDefaults>
-  <w:latentStyles w:defLockedState="0" w:defUIPriority="99" w:defSemiHidden="0" w:defUnhideWhenUsed="0" w:defQFormat="0" w:count="371">
+  <w:latentStyles w:defLockedState="0" w:defUIPriority="99" w:defSemiHidden="0" w:defUnhideWhenUsed="0" w:defQFormat="0" w:count="376">
     <w:lsdException w:name="Normal" w:uiPriority="0" w:qFormat="1"/>
     <w:lsdException w:name="heading 1" w:uiPriority="9" w:qFormat="1"/>
     <w:lsdException w:name="heading 2" w:semiHidden="1" w:uiPriority="9" w:unhideWhenUsed="1" w:qFormat="1"/>
@@ -4594,6 +4436,11 @@
     <w:lsdException w:name="List Table 5 Dark Accent 6" w:uiPriority="50"/>
     <w:lsdException w:name="List Table 6 Colorful Accent 6" w:uiPriority="51"/>
     <w:lsdException w:name="List Table 7 Colorful Accent 6" w:uiPriority="52"/>
+    <w:lsdException w:name="Mention" w:semiHidden="1" w:unhideWhenUsed="1"/>
+    <w:lsdException w:name="Smart Hyperlink" w:semiHidden="1" w:unhideWhenUsed="1"/>
+    <w:lsdException w:name="Hashtag" w:semiHidden="1" w:unhideWhenUsed="1"/>
+    <w:lsdException w:name="Unresolved Mention" w:semiHidden="1" w:unhideWhenUsed="1"/>
+    <w:lsdException w:name="Smart Link" w:semiHidden="1" w:unhideWhenUsed="1"/>
   </w:latentStyles>
   <w:style w:type="paragraph" w:default="1" w:styleId="Normal">
     <w:name w:val="Normal"/>

</xml_diff>